<commit_message>
Update reports for weeks 1-3
Co-Authored-By: Claude Sonnet 5.5 <noreply@anthropic.com>
</commit_message>
<xml_diff>
--- a/w3-rust-cli/report_week3.docx
+++ b/w3-rust-cli/report_week3.docx
@@ -11,11 +11,8 @@
       </w:r>
     </w:p>
     <w:p>
-      <w:pPr>
-        <w:pStyle w:val="Heading1"/>
-      </w:pPr>
       <w:r>
-        <w:t>Что сделано</w:t>
+        <w:t>Написал CLI-утилиту sol-tools на Rust (зависимости только clap и bs58) с командами lamports, sol, validate, fee и parse-ix. Код разнесён по 8 модулям, cargo fmt и cargo clippy без предупреждений, cargo test — 22 теста, все проходят.</w:t>
       </w:r>
     </w:p>
     <w:p>
@@ -23,7 +20,13 @@
         <w:pStyle w:val="ListBullet"/>
       </w:pPr>
       <w:r>
-        <w:t>Создан Rust-проект sol-tools (cargo, зависимости только clap и bs58).</w:t>
+        <w:rPr>
+          <w:b/>
+        </w:rPr>
+        <w:t xml:space="preserve">Типы: </w:t>
+      </w:r>
+      <w:r>
+        <w:t>lamports в u64, f64 только для отображения, &amp;str во входных параметрах, String в аргументах CLI</w:t>
       </w:r>
     </w:p>
     <w:p>
@@ -31,7 +34,13 @@
         <w:pStyle w:val="ListBullet"/>
       </w:pPr>
       <w:r>
-        <w:t>Команды: lamports, sol, validate, fee (с опциями --balance и --payer), parse-ix.</w:t>
+        <w:rPr>
+          <w:b/>
+        </w:rPr>
+        <w:t xml:space="preserve">struct и impl: </w:t>
+      </w:r>
+      <w:r>
+        <w:t>Pubkey([u8; 32]) и Wallet с методами deposit, withdraw, pay_fee</w:t>
       </w:r>
     </w:p>
     <w:p>
@@ -39,7 +48,13 @@
         <w:pStyle w:val="ListBullet"/>
       </w:pPr>
       <w:r>
-        <w:t>Код разнесён по 8 модулям, свой тип ошибок ToolError, без паник на пользовательском вводе.</w:t>
+        <w:rPr>
+          <w:b/>
+        </w:rPr>
+        <w:t xml:space="preserve">enum с данными: </w:t>
+      </w:r>
+      <w:r>
+        <w:t>Command (команды CLI), InstructionType (инструкции System Program), ToolError (ошибки)</w:t>
       </w:r>
     </w:p>
     <w:p>
@@ -47,7 +62,13 @@
         <w:pStyle w:val="ListBullet"/>
       </w:pPr>
       <w:r>
-        <w:t>Написано 22 unit-тестов (позитивные и негативные случаи), все проходят.</w:t>
+        <w:rPr>
+          <w:b/>
+        </w:rPr>
+        <w:t xml:space="preserve">Ownership и borrowing: </w:t>
+      </w:r>
+      <w:r>
+        <w:t>Wallet::new забирает String, into_label возвращает её; &amp;self для чтения, &amp;mut self для изменения баланса</w:t>
       </w:r>
     </w:p>
     <w:p>
@@ -55,7 +76,13 @@
         <w:pStyle w:val="ListBullet"/>
       </w:pPr>
       <w:r>
-        <w:t>cargo fmt, cargo clippy -D warnings (0 предупреждений), cargo build --release — успешно.</w:t>
+        <w:rPr>
+          <w:b/>
+        </w:rPr>
+        <w:t xml:space="preserve">Ошибки: </w:t>
+      </w:r>
+      <w:r>
+        <w:t>Result, Option и оператор ?, checked-арифметика вместо паник, свой ToolError с impl Display</w:t>
       </w:r>
     </w:p>
     <w:p>
@@ -63,909 +90,13 @@
         <w:pStyle w:val="ListBullet"/>
       </w:pPr>
       <w:r>
-        <w:t>README.md с инструкцией запуска и примерами.</w:t>
-      </w:r>
-    </w:p>
-    <w:p>
-      <w:pPr>
-        <w:pStyle w:val="Heading1"/>
-      </w:pPr>
-      <w:r>
-        <w:t>Структура проекта</w:t>
-      </w:r>
-    </w:p>
-    <w:p>
-      <w:pPr>
-        <w:spacing w:after="0"/>
-      </w:pPr>
-      <w:r>
         <w:rPr>
-          <w:rFonts w:ascii="Courier New" w:hAnsi="Courier New" w:eastAsia="Courier New"/>
-          <w:sz w:val="18"/>
+          <w:b/>
         </w:rPr>
-        <w:t>w3-rust-cli/</w:t>
-        <w:br/>
+        <w:t xml:space="preserve">Тесты: </w:t>
       </w:r>
       <w:r>
-        <w:rPr>
-          <w:rFonts w:ascii="Courier New" w:hAnsi="Courier New" w:eastAsia="Courier New"/>
-          <w:sz w:val="18"/>
-        </w:rPr>
-        <w:t>├── Cargo.toml        пакет sol-tools, зависимости clap, bs58</w:t>
-        <w:br/>
-      </w:r>
-      <w:r>
-        <w:rPr>
-          <w:rFonts w:ascii="Courier New" w:hAnsi="Courier New" w:eastAsia="Courier New"/>
-          <w:sz w:val="18"/>
-        </w:rPr>
-        <w:t>├── README.md         запуск и примеры</w:t>
-        <w:br/>
-      </w:r>
-      <w:r>
-        <w:rPr>
-          <w:rFonts w:ascii="Courier New" w:hAnsi="Courier New" w:eastAsia="Courier New"/>
-          <w:sz w:val="18"/>
-        </w:rPr>
-        <w:t>└── src/</w:t>
-        <w:br/>
-      </w:r>
-      <w:r>
-        <w:rPr>
-          <w:rFonts w:ascii="Courier New" w:hAnsi="Courier New" w:eastAsia="Courier New"/>
-          <w:sz w:val="18"/>
-        </w:rPr>
-        <w:t xml:space="preserve">    ├── main.rs        точка входа: разбор аргументов, вывод, exit code</w:t>
-        <w:br/>
-      </w:r>
-      <w:r>
-        <w:rPr>
-          <w:rFonts w:ascii="Courier New" w:hAnsi="Courier New" w:eastAsia="Courier New"/>
-          <w:sz w:val="18"/>
-        </w:rPr>
-        <w:t xml:space="preserve">    ├── cli.rs         enum Command с аргументами (clap derive)</w:t>
-        <w:br/>
-      </w:r>
-      <w:r>
-        <w:rPr>
-          <w:rFonts w:ascii="Courier New" w:hAnsi="Courier New" w:eastAsia="Courier New"/>
-          <w:sz w:val="18"/>
-        </w:rPr>
-        <w:t xml:space="preserve">    ├── commands.rs    обработчики команд -&gt; Result&lt;String, ToolError&gt;</w:t>
-        <w:br/>
-      </w:r>
-      <w:r>
-        <w:rPr>
-          <w:rFonts w:ascii="Courier New" w:hAnsi="Courier New" w:eastAsia="Courier New"/>
-          <w:sz w:val="18"/>
-        </w:rPr>
-        <w:t xml:space="preserve">    ├── errors.rs      enum ToolError + impl Display</w:t>
-        <w:br/>
-      </w:r>
-      <w:r>
-        <w:rPr>
-          <w:rFonts w:ascii="Courier New" w:hAnsi="Courier New" w:eastAsia="Courier New"/>
-          <w:sz w:val="18"/>
-        </w:rPr>
-        <w:t xml:space="preserve">    ├── units.rs       SOL &lt;-&gt; lamports, базовая комиссия</w:t>
-        <w:br/>
-      </w:r>
-      <w:r>
-        <w:rPr>
-          <w:rFonts w:ascii="Courier New" w:hAnsi="Courier New" w:eastAsia="Courier New"/>
-          <w:sz w:val="18"/>
-        </w:rPr>
-        <w:t xml:space="preserve">    ├── pubkey.rs      struct Pubkey([u8; 32]), base58</w:t>
-        <w:br/>
-      </w:r>
-      <w:r>
-        <w:rPr>
-          <w:rFonts w:ascii="Courier New" w:hAnsi="Courier New" w:eastAsia="Courier New"/>
-          <w:sz w:val="18"/>
-        </w:rPr>
-        <w:t xml:space="preserve">    ├── instruction.rs enum InstructionType + FromStr</w:t>
-        <w:br/>
-      </w:r>
-      <w:r>
-        <w:rPr>
-          <w:rFonts w:ascii="Courier New" w:hAnsi="Courier New" w:eastAsia="Courier New"/>
-          <w:sz w:val="18"/>
-        </w:rPr>
-        <w:t xml:space="preserve">    └── wallet.rs      struct Wallet: deposit / withdraw / pay_fee</w:t>
-      </w:r>
-    </w:p>
-    <w:p>
-      <w:pPr>
-        <w:pStyle w:val="Heading1"/>
-      </w:pPr>
-      <w:r>
-        <w:t>Конструкции Rust и где они использованы</w:t>
-      </w:r>
-    </w:p>
-    <w:tbl>
-      <w:tblPr>
-        <w:tblStyle w:val="TableGrid"/>
-        <w:tblW w:type="auto" w:w="0"/>
-        <w:tblLook w:firstColumn="1" w:firstRow="1" w:lastColumn="0" w:lastRow="0" w:noHBand="0" w:noVBand="1" w:val="04A0"/>
-      </w:tblPr>
-      <w:tblGrid>
-        <w:gridCol w:w="2880"/>
-        <w:gridCol w:w="2880"/>
-        <w:gridCol w:w="2880"/>
-      </w:tblGrid>
-      <w:tr>
-        <w:tc>
-          <w:tcPr>
-            <w:tcW w:type="dxa" w:w="2880"/>
-          </w:tcPr>
-          <w:p>
-            <w:r>
-              <w:rPr>
-                <w:sz w:val="20"/>
-              </w:rPr>
-            </w:r>
-            <w:r>
-              <w:rPr>
-                <w:b/>
-                <w:sz w:val="20"/>
-              </w:rPr>
-              <w:t>Концепция</w:t>
-            </w:r>
-          </w:p>
-        </w:tc>
-        <w:tc>
-          <w:tcPr>
-            <w:tcW w:type="dxa" w:w="2880"/>
-          </w:tcPr>
-          <w:p>
-            <w:r>
-              <w:rPr>
-                <w:sz w:val="20"/>
-              </w:rPr>
-            </w:r>
-            <w:r>
-              <w:rPr>
-                <w:b/>
-                <w:sz w:val="20"/>
-              </w:rPr>
-              <w:t>Где в коде</w:t>
-            </w:r>
-          </w:p>
-        </w:tc>
-        <w:tc>
-          <w:tcPr>
-            <w:tcW w:type="dxa" w:w="2880"/>
-          </w:tcPr>
-          <w:p>
-            <w:r>
-              <w:rPr>
-                <w:sz w:val="20"/>
-              </w:rPr>
-            </w:r>
-            <w:r>
-              <w:rPr>
-                <w:b/>
-                <w:sz w:val="20"/>
-              </w:rPr>
-              <w:t>Зачем в Solana</w:t>
-            </w:r>
-          </w:p>
-        </w:tc>
-      </w:tr>
-      <w:tr>
-        <w:tc>
-          <w:tcPr>
-            <w:tcW w:type="dxa" w:w="2880"/>
-          </w:tcPr>
-          <w:p>
-            <w:r>
-              <w:rPr>
-                <w:sz w:val="20"/>
-              </w:rPr>
-              <w:t>Типы u64, f64, String, &amp;str</w:t>
-            </w:r>
-          </w:p>
-        </w:tc>
-        <w:tc>
-          <w:tcPr>
-            <w:tcW w:type="dxa" w:w="2880"/>
-          </w:tcPr>
-          <w:p>
-            <w:r>
-              <w:rPr>
-                <w:sz w:val="20"/>
-              </w:rPr>
-              <w:t>units.rs: lamports — u64, f64 только в lamports_to_sol; cli.rs: String в аргументах; функции принимают &amp;str</w:t>
-            </w:r>
-          </w:p>
-        </w:tc>
-        <w:tc>
-          <w:tcPr>
-            <w:tcW w:type="dxa" w:w="2880"/>
-          </w:tcPr>
-          <w:p>
-            <w:r>
-              <w:rPr>
-                <w:sz w:val="20"/>
-              </w:rPr>
-              <w:t>Lamports в Solana — u64; float для денег даёт ошибки округления</w:t>
-            </w:r>
-          </w:p>
-        </w:tc>
-      </w:tr>
-      <w:tr>
-        <w:tc>
-          <w:tcPr>
-            <w:tcW w:type="dxa" w:w="2880"/>
-          </w:tcPr>
-          <w:p>
-            <w:r>
-              <w:rPr>
-                <w:sz w:val="20"/>
-              </w:rPr>
-              <w:t>Функции</w:t>
-            </w:r>
-          </w:p>
-        </w:tc>
-        <w:tc>
-          <w:tcPr>
-            <w:tcW w:type="dxa" w:w="2880"/>
-          </w:tcPr>
-          <w:p>
-            <w:r>
-              <w:rPr>
-                <w:sz w:val="20"/>
-              </w:rPr>
-              <w:t>units.rs: sol_to_lamports, format_sol, base_fee; commands.rs: run, group</w:t>
-            </w:r>
-          </w:p>
-        </w:tc>
-        <w:tc>
-          <w:tcPr>
-            <w:tcW w:type="dxa" w:w="2880"/>
-          </w:tcPr>
-          <w:p>
-            <w:r>
-              <w:rPr>
-                <w:sz w:val="20"/>
-              </w:rPr>
-              <w:t>Чистые функции легко тестировать</w:t>
-            </w:r>
-          </w:p>
-        </w:tc>
-      </w:tr>
-      <w:tr>
-        <w:tc>
-          <w:tcPr>
-            <w:tcW w:type="dxa" w:w="2880"/>
-          </w:tcPr>
-          <w:p>
-            <w:r>
-              <w:rPr>
-                <w:sz w:val="20"/>
-              </w:rPr>
-              <w:t>struct + impl</w:t>
-            </w:r>
-          </w:p>
-        </w:tc>
-        <w:tc>
-          <w:tcPr>
-            <w:tcW w:type="dxa" w:w="2880"/>
-          </w:tcPr>
-          <w:p>
-            <w:r>
-              <w:rPr>
-                <w:sz w:val="20"/>
-              </w:rPr>
-              <w:t>pubkey.rs: Pubkey([u8; 32]); wallet.rs: Wallet с методами deposit, withdraw, pay_fee</w:t>
-            </w:r>
-          </w:p>
-        </w:tc>
-        <w:tc>
-          <w:tcPr>
-            <w:tcW w:type="dxa" w:w="2880"/>
-          </w:tcPr>
-          <w:p>
-            <w:r>
-              <w:rPr>
-                <w:sz w:val="20"/>
-              </w:rPr>
-              <w:t>Pubkey в Solana — ровно 32 байта; состояние аккаунта — struct</w:t>
-            </w:r>
-          </w:p>
-        </w:tc>
-      </w:tr>
-      <w:tr>
-        <w:tc>
-          <w:tcPr>
-            <w:tcW w:type="dxa" w:w="2880"/>
-          </w:tcPr>
-          <w:p>
-            <w:r>
-              <w:rPr>
-                <w:sz w:val="20"/>
-              </w:rPr>
-              <w:t>enum с данными</w:t>
-            </w:r>
-          </w:p>
-        </w:tc>
-        <w:tc>
-          <w:tcPr>
-            <w:tcW w:type="dxa" w:w="2880"/>
-          </w:tcPr>
-          <w:p>
-            <w:r>
-              <w:rPr>
-                <w:sz w:val="20"/>
-              </w:rPr>
-              <w:t>cli.rs: Command { Fee { signatures, balance, payer } … }; errors.rs: InsufficientFunds { needed, available }; instruction.rs: InstructionType</w:t>
-            </w:r>
-          </w:p>
-        </w:tc>
-        <w:tc>
-          <w:tcPr>
-            <w:tcW w:type="dxa" w:w="2880"/>
-          </w:tcPr>
-          <w:p>
-            <w:r>
-              <w:rPr>
-                <w:sz w:val="20"/>
-              </w:rPr>
-              <w:t>Инструкции программ описываются enum, ошибки — enum кодов</w:t>
-            </w:r>
-          </w:p>
-        </w:tc>
-      </w:tr>
-      <w:tr>
-        <w:tc>
-          <w:tcPr>
-            <w:tcW w:type="dxa" w:w="2880"/>
-          </w:tcPr>
-          <w:p>
-            <w:r>
-              <w:rPr>
-                <w:sz w:val="20"/>
-              </w:rPr>
-              <w:t>Ownership</w:t>
-            </w:r>
-          </w:p>
-        </w:tc>
-        <w:tc>
-          <w:tcPr>
-            <w:tcW w:type="dxa" w:w="2880"/>
-          </w:tcPr>
-          <w:p>
-            <w:r>
-              <w:rPr>
-                <w:sz w:val="20"/>
-              </w:rPr>
-              <w:t>wallet.rs: Wallet::new(label: String) забирает строку; with_pubkey(self) -&gt; Wallet; into_label(self) -&gt; String</w:t>
-            </w:r>
-          </w:p>
-        </w:tc>
-        <w:tc>
-          <w:tcPr>
-            <w:tcW w:type="dxa" w:w="2880"/>
-          </w:tcPr>
-          <w:p>
-            <w:r>
-              <w:rPr>
-                <w:sz w:val="20"/>
-              </w:rPr>
-              <w:t>Контроль, кто владеет данными, без сборщика мусора</w:t>
-            </w:r>
-          </w:p>
-        </w:tc>
-      </w:tr>
-      <w:tr>
-        <w:tc>
-          <w:tcPr>
-            <w:tcW w:type="dxa" w:w="2880"/>
-          </w:tcPr>
-          <w:p>
-            <w:r>
-              <w:rPr>
-                <w:sz w:val="20"/>
-              </w:rPr>
-              <w:t>Borrowing &amp; / &amp;mut</w:t>
-            </w:r>
-          </w:p>
-        </w:tc>
-        <w:tc>
-          <w:tcPr>
-            <w:tcW w:type="dxa" w:w="2880"/>
-          </w:tcPr>
-          <w:p>
-            <w:r>
-              <w:rPr>
-                <w:sz w:val="20"/>
-              </w:rPr>
-              <w:t>commands.rs: run(&amp;Command), validate(&amp;str); wallet.rs: withdraw(&amp;mut self), lamports(&amp;self)</w:t>
-            </w:r>
-          </w:p>
-        </w:tc>
-        <w:tc>
-          <w:tcPr>
-            <w:tcW w:type="dxa" w:w="2880"/>
-          </w:tcPr>
-          <w:p>
-            <w:r>
-              <w:rPr>
-                <w:sz w:val="20"/>
-              </w:rPr>
-              <w:t>В Anchor аккаунты передаются как &amp;mut — изменять может только тот, у кого мутабельная ссылка</w:t>
-            </w:r>
-          </w:p>
-        </w:tc>
-      </w:tr>
-      <w:tr>
-        <w:tc>
-          <w:tcPr>
-            <w:tcW w:type="dxa" w:w="2880"/>
-          </w:tcPr>
-          <w:p>
-            <w:r>
-              <w:rPr>
-                <w:sz w:val="20"/>
-              </w:rPr>
-              <w:t>Result, ?, Option</w:t>
-            </w:r>
-          </w:p>
-        </w:tc>
-        <w:tc>
-          <w:tcPr>
-            <w:tcW w:type="dxa" w:w="2880"/>
-          </w:tcPr>
-          <w:p>
-            <w:r>
-              <w:rPr>
-                <w:sz w:val="20"/>
-              </w:rPr>
-              <w:t>units.rs: checked_mul(...).ok_or(Overflow)?; instruction.rs: from_name -&gt; Option, FromStr -&gt; Result; cli.rs: balance: Option&lt;String&gt;</w:t>
-            </w:r>
-          </w:p>
-        </w:tc>
-        <w:tc>
-          <w:tcPr>
-            <w:tcW w:type="dxa" w:w="2880"/>
-          </w:tcPr>
-          <w:p>
-            <w:r>
-              <w:rPr>
-                <w:sz w:val="20"/>
-              </w:rPr>
-              <w:t>Программа Solana возвращает ProgramResult; паника = провал всей транзакции без понятной причины</w:t>
-            </w:r>
-          </w:p>
-        </w:tc>
-      </w:tr>
-      <w:tr>
-        <w:tc>
-          <w:tcPr>
-            <w:tcW w:type="dxa" w:w="2880"/>
-          </w:tcPr>
-          <w:p>
-            <w:r>
-              <w:rPr>
-                <w:sz w:val="20"/>
-              </w:rPr>
-              <w:t>Свой enum ошибок + Display</w:t>
-            </w:r>
-          </w:p>
-        </w:tc>
-        <w:tc>
-          <w:tcPr>
-            <w:tcW w:type="dxa" w:w="2880"/>
-          </w:tcPr>
-          <w:p>
-            <w:r>
-              <w:rPr>
-                <w:sz w:val="20"/>
-              </w:rPr>
-              <w:t>errors.rs: ToolError, impl fmt::Display, impl std::error::Error</w:t>
-            </w:r>
-          </w:p>
-        </w:tc>
-        <w:tc>
-          <w:tcPr>
-            <w:tcW w:type="dxa" w:w="2880"/>
-          </w:tcPr>
-          <w:p>
-            <w:r>
-              <w:rPr>
-                <w:sz w:val="20"/>
-              </w:rPr>
-              <w:t>Аналог ProgramError / #[error_code] в Anchor</w:t>
-            </w:r>
-          </w:p>
-        </w:tc>
-      </w:tr>
-      <w:tr>
-        <w:tc>
-          <w:tcPr>
-            <w:tcW w:type="dxa" w:w="2880"/>
-          </w:tcPr>
-          <w:p>
-            <w:r>
-              <w:rPr>
-                <w:sz w:val="20"/>
-              </w:rPr>
-              <w:t>Модули</w:t>
-            </w:r>
-          </w:p>
-        </w:tc>
-        <w:tc>
-          <w:tcPr>
-            <w:tcW w:type="dxa" w:w="2880"/>
-          </w:tcPr>
-          <w:p>
-            <w:r>
-              <w:rPr>
-                <w:sz w:val="20"/>
-              </w:rPr>
-              <w:t>main.rs: mod cli; mod commands; mod errors; …; use crate::…</w:t>
-            </w:r>
-          </w:p>
-        </w:tc>
-        <w:tc>
-          <w:tcPr>
-            <w:tcW w:type="dxa" w:w="2880"/>
-          </w:tcPr>
-          <w:p>
-            <w:r>
-              <w:rPr>
-                <w:sz w:val="20"/>
-              </w:rPr>
-              <w:t>Программы Anchor так же делят на instructions/, state/, errors.rs</w:t>
-            </w:r>
-          </w:p>
-        </w:tc>
-      </w:tr>
-      <w:tr>
-        <w:tc>
-          <w:tcPr>
-            <w:tcW w:type="dxa" w:w="2880"/>
-          </w:tcPr>
-          <w:p>
-            <w:r>
-              <w:rPr>
-                <w:sz w:val="20"/>
-              </w:rPr>
-              <w:t>cargo test</w:t>
-            </w:r>
-          </w:p>
-        </w:tc>
-        <w:tc>
-          <w:tcPr>
-            <w:tcW w:type="dxa" w:w="2880"/>
-          </w:tcPr>
-          <w:p>
-            <w:r>
-              <w:rPr>
-                <w:sz w:val="20"/>
-              </w:rPr>
-              <w:t>#[cfg(test)] mod tests в каждом модуле, 22 теста</w:t>
-            </w:r>
-          </w:p>
-        </w:tc>
-        <w:tc>
-          <w:tcPr>
-            <w:tcW w:type="dxa" w:w="2880"/>
-          </w:tcPr>
-          <w:p>
-            <w:r>
-              <w:rPr>
-                <w:sz w:val="20"/>
-              </w:rPr>
-              <w:t>Логику проверяют до деплоя: ошибка on-chain стоит денег</w:t>
-            </w:r>
-          </w:p>
-        </w:tc>
-      </w:tr>
-    </w:tbl>
-    <w:p>
-      <w:pPr>
-        <w:pStyle w:val="Heading1"/>
-      </w:pPr>
-      <w:r>
-        <w:t>Примеры запуска</w:t>
-      </w:r>
-    </w:p>
-    <w:p>
-      <w:pPr>
-        <w:spacing w:after="0"/>
-      </w:pPr>
-      <w:r>
-        <w:rPr>
-          <w:rFonts w:ascii="Courier New" w:hAnsi="Courier New" w:eastAsia="Courier New"/>
-          <w:sz w:val="16"/>
-        </w:rPr>
-        <w:t>$ sol-tools lamports 1.5</w:t>
-        <w:br/>
-      </w:r>
-      <w:r>
-        <w:rPr>
-          <w:rFonts w:ascii="Courier New" w:hAnsi="Courier New" w:eastAsia="Courier New"/>
-          <w:sz w:val="16"/>
-        </w:rPr>
-        <w:t>1.5 SOL = 1 500 000 000 lamports</w:t>
-        <w:br/>
-      </w:r>
-      <w:r>
-        <w:rPr>
-          <w:rFonts w:ascii="Courier New" w:hAnsi="Courier New" w:eastAsia="Courier New"/>
-          <w:sz w:val="16"/>
-        </w:rPr>
-        <w:t>$ sol-tools sol 899995000</w:t>
-        <w:br/>
-      </w:r>
-      <w:r>
-        <w:rPr>
-          <w:rFonts w:ascii="Courier New" w:hAnsi="Courier New" w:eastAsia="Courier New"/>
-          <w:sz w:val="16"/>
-        </w:rPr>
-        <w:t>899 995 000 lamports = 0.899995 SOL (f64: 0.899995)</w:t>
-        <w:br/>
-      </w:r>
-      <w:r>
-        <w:rPr>
-          <w:rFonts w:ascii="Courier New" w:hAnsi="Courier New" w:eastAsia="Courier New"/>
-          <w:sz w:val="16"/>
-        </w:rPr>
-        <w:t>$ sol-tools validate 6gAYJ35qhM1WznJz5d2kRa3mG5HdC2VwvhQGvoSY1sgF</w:t>
-        <w:br/>
-      </w:r>
-      <w:r>
-        <w:rPr>
-          <w:rFonts w:ascii="Courier New" w:hAnsi="Courier New" w:eastAsia="Courier New"/>
-          <w:sz w:val="16"/>
-        </w:rPr>
-        <w:t>OK: корректный публичный ключ, длина 32 байта</w:t>
-        <w:br/>
-      </w:r>
-      <w:r>
-        <w:rPr>
-          <w:rFonts w:ascii="Courier New" w:hAnsi="Courier New" w:eastAsia="Courier New"/>
-          <w:sz w:val="16"/>
-        </w:rPr>
-        <w:t>6gAYJ35qhM1WznJz5d2kRa3mG5HdC2VwvhQGvoSY1sgF</w:t>
-        <w:br/>
-      </w:r>
-      <w:r>
-        <w:rPr>
-          <w:rFonts w:ascii="Courier New" w:hAnsi="Courier New" w:eastAsia="Courier New"/>
-          <w:sz w:val="16"/>
-        </w:rPr>
-        <w:t>$ sol-tools validate 11111111111111111111111111111111</w:t>
-        <w:br/>
-      </w:r>
-      <w:r>
-        <w:rPr>
-          <w:rFonts w:ascii="Courier New" w:hAnsi="Courier New" w:eastAsia="Courier New"/>
-          <w:sz w:val="16"/>
-        </w:rPr>
-        <w:t>OK: корректный публичный ключ, длина 32 байта</w:t>
-        <w:br/>
-      </w:r>
-      <w:r>
-        <w:rPr>
-          <w:rFonts w:ascii="Courier New" w:hAnsi="Courier New" w:eastAsia="Courier New"/>
-          <w:sz w:val="16"/>
-        </w:rPr>
-        <w:t>11111111111111111111111111111111</w:t>
-        <w:br/>
-      </w:r>
-      <w:r>
-        <w:rPr>
-          <w:rFonts w:ascii="Courier New" w:hAnsi="Courier New" w:eastAsia="Courier New"/>
-          <w:sz w:val="16"/>
-        </w:rPr>
-        <w:t>это System Program</w:t>
-        <w:br/>
-      </w:r>
-      <w:r>
-        <w:rPr>
-          <w:rFonts w:ascii="Courier New" w:hAnsi="Courier New" w:eastAsia="Courier New"/>
-          <w:sz w:val="16"/>
-        </w:rPr>
-        <w:t>$ sol-tools fee 1</w:t>
-        <w:br/>
-      </w:r>
-      <w:r>
-        <w:rPr>
-          <w:rFonts w:ascii="Courier New" w:hAnsi="Courier New" w:eastAsia="Courier New"/>
-          <w:sz w:val="16"/>
-        </w:rPr>
-        <w:t>подписей: 1</w:t>
-        <w:br/>
-      </w:r>
-      <w:r>
-        <w:rPr>
-          <w:rFonts w:ascii="Courier New" w:hAnsi="Courier New" w:eastAsia="Courier New"/>
-          <w:sz w:val="16"/>
-        </w:rPr>
-        <w:t>базовая комиссия: 5 000 lamports = 0.000005 SOL</w:t>
-        <w:br/>
-      </w:r>
-      <w:r>
-        <w:rPr>
-          <w:rFonts w:ascii="Courier New" w:hAnsi="Courier New" w:eastAsia="Courier New"/>
-          <w:sz w:val="16"/>
-        </w:rPr>
-        <w:t>$ sol-tools fee 3 --balance 0.1 --payer 2KWU4aTFFwChdU2YxYj1LD8b6eqC7Kum7hHsKDsaFXv9</w:t>
-        <w:br/>
-      </w:r>
-      <w:r>
-        <w:rPr>
-          <w:rFonts w:ascii="Courier New" w:hAnsi="Courier New" w:eastAsia="Courier New"/>
-          <w:sz w:val="16"/>
-        </w:rPr>
-        <w:t>подписей: 3</w:t>
-        <w:br/>
-      </w:r>
-      <w:r>
-        <w:rPr>
-          <w:rFonts w:ascii="Courier New" w:hAnsi="Courier New" w:eastAsia="Courier New"/>
-          <w:sz w:val="16"/>
-        </w:rPr>
-        <w:t>базовая комиссия: 15 000 lamports = 0.000015 SOL</w:t>
-        <w:br/>
-      </w:r>
-      <w:r>
-        <w:rPr>
-          <w:rFonts w:ascii="Courier New" w:hAnsi="Courier New" w:eastAsia="Courier New"/>
-          <w:sz w:val="16"/>
-        </w:rPr>
-        <w:t>fee payer 2KWU4aTFFwChdU2YxYj1LD8b6eqC7Kum7hHsKDsaFXv9: 0.1 SOL -&gt; после комиссии 0.099985 SOL</w:t>
-        <w:br/>
-      </w:r>
-      <w:r>
-        <w:rPr>
-          <w:rFonts w:ascii="Courier New" w:hAnsi="Courier New" w:eastAsia="Courier New"/>
-          <w:sz w:val="16"/>
-        </w:rPr>
-        <w:t>$ sol-tools parse-ix transfer</w:t>
-        <w:br/>
-      </w:r>
-      <w:r>
-        <w:rPr>
-          <w:rFonts w:ascii="Courier New" w:hAnsi="Courier New" w:eastAsia="Courier New"/>
-          <w:sz w:val="16"/>
-        </w:rPr>
-        <w:t>Transfer (индекс 2 в System Program)</w:t>
-        <w:br/>
-      </w:r>
-      <w:r>
-        <w:rPr>
-          <w:rFonts w:ascii="Courier New" w:hAnsi="Courier New" w:eastAsia="Courier New"/>
-          <w:sz w:val="16"/>
-        </w:rPr>
-        <w:t>перевести lamports с одного аккаунта на другой</w:t>
-        <w:br/>
-      </w:r>
-      <w:r>
-        <w:rPr>
-          <w:rFonts w:ascii="Courier New" w:hAnsi="Courier New" w:eastAsia="Courier New"/>
-          <w:sz w:val="16"/>
-        </w:rPr>
-        <w:t>accounts: from (signer, writable); to (writable)</w:t>
-        <w:br/>
-      </w:r>
-      <w:r>
-        <w:rPr>
-          <w:rFonts w:ascii="Courier New" w:hAnsi="Courier New" w:eastAsia="Courier New"/>
-          <w:sz w:val="16"/>
-        </w:rPr>
-        <w:t>$ sol-tools lamports 1.0000000001</w:t>
-        <w:br/>
-      </w:r>
-      <w:r>
-        <w:rPr>
-          <w:rFonts w:ascii="Courier New" w:hAnsi="Courier New" w:eastAsia="Courier New"/>
-          <w:sz w:val="16"/>
-        </w:rPr>
-        <w:t>ошибка: слишком точная сумма: 10 знаков после точки, максимум 9 (1 lamport = 0.000000001 SOL)</w:t>
-        <w:br/>
-      </w:r>
-      <w:r>
-        <w:rPr>
-          <w:rFonts w:ascii="Courier New" w:hAnsi="Courier New" w:eastAsia="Courier New"/>
-          <w:sz w:val="16"/>
-        </w:rPr>
-        <w:t>$ sol-tools validate abc</w:t>
-        <w:br/>
-      </w:r>
-      <w:r>
-        <w:rPr>
-          <w:rFonts w:ascii="Courier New" w:hAnsi="Courier New" w:eastAsia="Courier New"/>
-          <w:sz w:val="16"/>
-        </w:rPr>
-        <w:t>ошибка: неверная длина публичного ключа: получено байт — 3, нужно 32</w:t>
-        <w:br/>
-      </w:r>
-      <w:r>
-        <w:rPr>
-          <w:rFonts w:ascii="Courier New" w:hAnsi="Courier New" w:eastAsia="Courier New"/>
-          <w:sz w:val="16"/>
-        </w:rPr>
-        <w:t>$ sol-tools fee 1 --balance 0.000001</w:t>
-        <w:br/>
-      </w:r>
-      <w:r>
-        <w:rPr>
-          <w:rFonts w:ascii="Courier New" w:hAnsi="Courier New" w:eastAsia="Courier New"/>
-          <w:sz w:val="16"/>
-        </w:rPr>
-        <w:t>ошибка: недостаточно средств: нужно 5000 lamports, доступно 1000</w:t>
-        <w:br/>
-      </w:r>
-      <w:r>
-        <w:rPr>
-          <w:rFonts w:ascii="Courier New" w:hAnsi="Courier New" w:eastAsia="Courier New"/>
-          <w:sz w:val="16"/>
-        </w:rPr>
-        <w:t>$ sol-tools parse-ix swap</w:t>
-        <w:br/>
-      </w:r>
-      <w:r>
-        <w:rPr>
-          <w:rFonts w:ascii="Courier New" w:hAnsi="Courier New" w:eastAsia="Courier New"/>
-          <w:sz w:val="16"/>
-        </w:rPr>
-        <w:t>ошибка: неизвестный тип инструкции 'swap'. Доступно: CreateAccount, Assign, Transfer, CreateAccountWithSeed, AdvanceNonceAccount, Allocate</w:t>
-      </w:r>
-    </w:p>
-    <w:p>
-      <w:pPr>
-        <w:pStyle w:val="Heading1"/>
-      </w:pPr>
-      <w:r>
-        <w:t>Результат cargo test</w:t>
-      </w:r>
-    </w:p>
-    <w:p>
-      <w:r>
-        <w:t>running 22 tests — test result: ok. 22 passed; 0 failed.</w:t>
-      </w:r>
-    </w:p>
-    <w:p>
-      <w:pPr>
-        <w:pStyle w:val="ListBullet"/>
-      </w:pPr>
-      <w:r>
-        <w:t>commands.rs (4): форматирование чисел, маршрутизация команд, fee с балансом, проброс ошибок через ?.</w:t>
-      </w:r>
-    </w:p>
-    <w:p>
-      <w:pPr>
-        <w:pStyle w:val="ListBullet"/>
-      </w:pPr>
-      <w:r>
-        <w:t>instruction.rs (4): разбор имён в любом регистре, индексы как в System Program, понятная ошибка для неизвестного типа.</w:t>
-      </w:r>
-    </w:p>
-    <w:p>
-      <w:pPr>
-        <w:pStyle w:val="ListBullet"/>
-      </w:pPr>
-      <w:r>
-        <w:t>pubkey.rs (4): валидный ключ и обратное кодирование, System Program = 32 нуля, недопустимые символы base58, неверная длина (3 и 64 байта).</w:t>
-      </w:r>
-    </w:p>
-    <w:p>
-      <w:pPr>
-        <w:pStyle w:val="ListBullet"/>
-      </w:pPr>
-      <w:r>
-        <w:t>units.rs (6): конвертация SOL/lamports, ловушка float (0.3), неверный ввод, &gt;9 знаков, переполнение u64, комиссия за подписи.</w:t>
-      </w:r>
-    </w:p>
-    <w:p>
-      <w:pPr>
-        <w:pStyle w:val="ListBullet"/>
-      </w:pPr>
-      <w:r>
-        <w:t>wallet.rs (4): пополнение/списание, нехватка средств без изменения баланса, расчёт как в транзакции недели 1, передача владения.</w:t>
+        <w:t>конвертация и ловушка float, переполнение u64, неверный base58 и длина ключа, нехватка средств, неизвестная инструкция</w:t>
       </w:r>
     </w:p>
     <w:p>
@@ -978,7 +109,7 @@
     </w:p>
     <w:p>
       <w:r>
-        <w:t>Сделал небольшую CLI на Rust и применил основные конструкции, которые нужны для Solana-программ. Суммы храню в u64 и считаю checked-операциями, поэтому ни переполнение, ни float не искажают баланс. Все ошибки — это значения enum ToolError, которые возвращаются через Result и оператор ?, а не паники; так же устроены ProgramError и ошибки Anchor. Ownership и заимствования показывают, кто и как может менять данные, — то же правило, что у writable-аккаунтов в транзакции. Тесты закрепляют поведение до запуска, что особенно важно для кода, который потом работает с реальными деньгами.</w:t>
+        <w:t>Эти конструкции напрямую используются в Solana-программах: суммы в u64 с проверкой переполнения, ошибки через Result вместо паник, изменение данных только через &amp;mut. Тесты позволяют проверить логику до деплоя, где ошибка стоит реальных денег.</w:t>
       </w:r>
     </w:p>
     <w:sectPr>

</xml_diff>